<commit_message>
test(perf): tables-30p lays out to 30 pages again; the perf harness checks both fixtures (closes #476)
tables-30p.docx laid out to 22 pages (one page per tower at the editor's
boot metrics), not the 30 its name and the #379 repaint timing assume:
TABLE_TOWERS 22 -> 30. tools/perf now reports the laid-out page count of 50p
and tables-30p and --strict fails when either is more than 10 % off nominal
(50 / 30), so the next pitch or font-stack change cannot silently turn them
into other documents.

Closes #476 (items 1-3: fixtures + budgets re-baselined on a release build,
corpus-native lays the production layout out with the editor's boot fonts,
tools/differential compares bug65649 + the docx4j samples). Item 4 (Vello
golden, no GPU on this box) stays open; #489 item 5 (re-baseline tools/perf
on a release build) is done here.

Co-Authored-By: Claude Sonnet 5.5 <noreply@anthropic.com>
</commit_message>
<xml_diff>
--- a/tests/perf/tables-30p.docx
+++ b/tests/perf/tables-30p.docx
@@ -2361,6 +2361,862 @@
         <w:t xml:space="preserve">Between towers 021. The quick brown fox jumps over the lazy dog. مرحبا بالعالم، هذا نص حشو لقياس استهلاك الذاكرة.</w:t>
       </w:r>
     </w:p>
+    <w:tbl>
+      <w:tr>
+        <w:tc>
+          <w:p>
+            <w:r>
+              <w:t xml:space="preserve">Tower 022, level 0</w:t>
+            </w:r>
+          </w:p>
+          <w:tbl>
+            <w:tr>
+              <w:tc>
+                <w:p>
+                  <w:r>
+                    <w:t xml:space="preserve">Tower 022, level 1</w:t>
+                  </w:r>
+                </w:p>
+                <w:tbl>
+                  <w:tr>
+                    <w:tc>
+                      <w:p>
+                        <w:r>
+                          <w:t xml:space="preserve">Tower 022, level 2</w:t>
+                        </w:r>
+                      </w:p>
+                    </w:tc>
+                    <w:tc>
+                      <w:p>
+                        <w:r>
+                          <w:t xml:space="preserve">Cell 022.2.1 fox مرحبا</w:t>
+                        </w:r>
+                      </w:p>
+                    </w:tc>
+                  </w:tr>
+                  <w:tr>
+                    <w:tc>
+                      <w:p>
+                        <w:r>
+                          <w:t xml:space="preserve">Cell 022.2.2 fox مرحبا</w:t>
+                        </w:r>
+                      </w:p>
+                    </w:tc>
+                    <w:tc>
+                      <w:p>
+                        <w:r>
+                          <w:t xml:space="preserve">Cell 022.2.3 fox مرحبا</w:t>
+                        </w:r>
+                      </w:p>
+                    </w:tc>
+                  </w:tr>
+                </w:tbl>
+              </w:tc>
+              <w:tc>
+                <w:p>
+                  <w:r>
+                    <w:t xml:space="preserve">Cell 022.1.1 fox مرحبا</w:t>
+                  </w:r>
+                </w:p>
+              </w:tc>
+            </w:tr>
+            <w:tr>
+              <w:tc>
+                <w:p>
+                  <w:r>
+                    <w:t xml:space="preserve">Cell 022.1.2 fox مرحبا</w:t>
+                  </w:r>
+                </w:p>
+              </w:tc>
+              <w:tc>
+                <w:p>
+                  <w:r>
+                    <w:t xml:space="preserve">Cell 022.1.3 fox مرحبا</w:t>
+                  </w:r>
+                </w:p>
+              </w:tc>
+            </w:tr>
+          </w:tbl>
+        </w:tc>
+        <w:tc>
+          <w:p>
+            <w:r>
+              <w:t xml:space="preserve">Cell 022.0.1 fox مرحبا</w:t>
+            </w:r>
+          </w:p>
+        </w:tc>
+      </w:tr>
+      <w:tr>
+        <w:tc>
+          <w:p>
+            <w:r>
+              <w:t xml:space="preserve">Cell 022.0.2 fox مرحبا</w:t>
+            </w:r>
+          </w:p>
+        </w:tc>
+        <w:tc>
+          <w:p>
+            <w:r>
+              <w:t xml:space="preserve">Cell 022.0.3 fox مرحبا</w:t>
+            </w:r>
+          </w:p>
+        </w:tc>
+      </w:tr>
+    </w:tbl>
+    <w:p>
+      <w:r>
+        <w:t xml:space="preserve">Between towers 022. The quick brown fox jumps over the lazy dog. مرحبا بالعالم، هذا نص حشو لقياس استهلاك الذاكرة.</w:t>
+      </w:r>
+    </w:p>
+    <w:tbl>
+      <w:tr>
+        <w:tc>
+          <w:p>
+            <w:r>
+              <w:t xml:space="preserve">Tower 023, level 0</w:t>
+            </w:r>
+          </w:p>
+          <w:tbl>
+            <w:tr>
+              <w:tc>
+                <w:p>
+                  <w:r>
+                    <w:t xml:space="preserve">Tower 023, level 1</w:t>
+                  </w:r>
+                </w:p>
+                <w:tbl>
+                  <w:tr>
+                    <w:tc>
+                      <w:p>
+                        <w:r>
+                          <w:t xml:space="preserve">Tower 023, level 2</w:t>
+                        </w:r>
+                      </w:p>
+                    </w:tc>
+                    <w:tc>
+                      <w:p>
+                        <w:r>
+                          <w:t xml:space="preserve">Cell 023.2.1 fox مرحبا</w:t>
+                        </w:r>
+                      </w:p>
+                    </w:tc>
+                  </w:tr>
+                  <w:tr>
+                    <w:tc>
+                      <w:p>
+                        <w:r>
+                          <w:t xml:space="preserve">Cell 023.2.2 fox مرحبا</w:t>
+                        </w:r>
+                      </w:p>
+                    </w:tc>
+                    <w:tc>
+                      <w:p>
+                        <w:r>
+                          <w:t xml:space="preserve">Cell 023.2.3 fox مرحبا</w:t>
+                        </w:r>
+                      </w:p>
+                    </w:tc>
+                  </w:tr>
+                </w:tbl>
+              </w:tc>
+              <w:tc>
+                <w:p>
+                  <w:r>
+                    <w:t xml:space="preserve">Cell 023.1.1 fox مرحبا</w:t>
+                  </w:r>
+                </w:p>
+              </w:tc>
+            </w:tr>
+            <w:tr>
+              <w:tc>
+                <w:p>
+                  <w:r>
+                    <w:t xml:space="preserve">Cell 023.1.2 fox مرحبا</w:t>
+                  </w:r>
+                </w:p>
+              </w:tc>
+              <w:tc>
+                <w:p>
+                  <w:r>
+                    <w:t xml:space="preserve">Cell 023.1.3 fox مرحبا</w:t>
+                  </w:r>
+                </w:p>
+              </w:tc>
+            </w:tr>
+          </w:tbl>
+        </w:tc>
+        <w:tc>
+          <w:p>
+            <w:r>
+              <w:t xml:space="preserve">Cell 023.0.1 fox مرحبا</w:t>
+            </w:r>
+          </w:p>
+        </w:tc>
+      </w:tr>
+      <w:tr>
+        <w:tc>
+          <w:p>
+            <w:r>
+              <w:t xml:space="preserve">Cell 023.0.2 fox مرحبا</w:t>
+            </w:r>
+          </w:p>
+        </w:tc>
+        <w:tc>
+          <w:p>
+            <w:r>
+              <w:t xml:space="preserve">Cell 023.0.3 fox مرحبا</w:t>
+            </w:r>
+          </w:p>
+        </w:tc>
+      </w:tr>
+    </w:tbl>
+    <w:p>
+      <w:r>
+        <w:t xml:space="preserve">Between towers 023. The quick brown fox jumps over the lazy dog. مرحبا بالعالم، هذا نص حشو لقياس استهلاك الذاكرة.</w:t>
+      </w:r>
+    </w:p>
+    <w:tbl>
+      <w:tr>
+        <w:tc>
+          <w:p>
+            <w:r>
+              <w:t xml:space="preserve">Tower 024, level 0</w:t>
+            </w:r>
+          </w:p>
+          <w:tbl>
+            <w:tr>
+              <w:tc>
+                <w:p>
+                  <w:r>
+                    <w:t xml:space="preserve">Tower 024, level 1</w:t>
+                  </w:r>
+                </w:p>
+                <w:tbl>
+                  <w:tr>
+                    <w:tc>
+                      <w:p>
+                        <w:r>
+                          <w:t xml:space="preserve">Tower 024, level 2</w:t>
+                        </w:r>
+                      </w:p>
+                    </w:tc>
+                    <w:tc>
+                      <w:p>
+                        <w:r>
+                          <w:t xml:space="preserve">Cell 024.2.1 fox مرحبا</w:t>
+                        </w:r>
+                      </w:p>
+                    </w:tc>
+                  </w:tr>
+                  <w:tr>
+                    <w:tc>
+                      <w:p>
+                        <w:r>
+                          <w:t xml:space="preserve">Cell 024.2.2 fox مرحبا</w:t>
+                        </w:r>
+                      </w:p>
+                    </w:tc>
+                    <w:tc>
+                      <w:p>
+                        <w:r>
+                          <w:t xml:space="preserve">Cell 024.2.3 fox مرحبا</w:t>
+                        </w:r>
+                      </w:p>
+                    </w:tc>
+                  </w:tr>
+                </w:tbl>
+              </w:tc>
+              <w:tc>
+                <w:p>
+                  <w:r>
+                    <w:t xml:space="preserve">Cell 024.1.1 fox مرحبا</w:t>
+                  </w:r>
+                </w:p>
+              </w:tc>
+            </w:tr>
+            <w:tr>
+              <w:tc>
+                <w:p>
+                  <w:r>
+                    <w:t xml:space="preserve">Cell 024.1.2 fox مرحبا</w:t>
+                  </w:r>
+                </w:p>
+              </w:tc>
+              <w:tc>
+                <w:p>
+                  <w:r>
+                    <w:t xml:space="preserve">Cell 024.1.3 fox مرحبا</w:t>
+                  </w:r>
+                </w:p>
+              </w:tc>
+            </w:tr>
+          </w:tbl>
+        </w:tc>
+        <w:tc>
+          <w:p>
+            <w:r>
+              <w:t xml:space="preserve">Cell 024.0.1 fox مرحبا</w:t>
+            </w:r>
+          </w:p>
+        </w:tc>
+      </w:tr>
+      <w:tr>
+        <w:tc>
+          <w:p>
+            <w:r>
+              <w:t xml:space="preserve">Cell 024.0.2 fox مرحبا</w:t>
+            </w:r>
+          </w:p>
+        </w:tc>
+        <w:tc>
+          <w:p>
+            <w:r>
+              <w:t xml:space="preserve">Cell 024.0.3 fox مرحبا</w:t>
+            </w:r>
+          </w:p>
+        </w:tc>
+      </w:tr>
+    </w:tbl>
+    <w:p>
+      <w:r>
+        <w:t xml:space="preserve">Between towers 024. The quick brown fox jumps over the lazy dog. مرحبا بالعالم، هذا نص حشو لقياس استهلاك الذاكرة.</w:t>
+      </w:r>
+    </w:p>
+    <w:tbl>
+      <w:tr>
+        <w:tc>
+          <w:p>
+            <w:r>
+              <w:t xml:space="preserve">Tower 025, level 0</w:t>
+            </w:r>
+          </w:p>
+          <w:tbl>
+            <w:tr>
+              <w:tc>
+                <w:p>
+                  <w:r>
+                    <w:t xml:space="preserve">Tower 025, level 1</w:t>
+                  </w:r>
+                </w:p>
+                <w:tbl>
+                  <w:tr>
+                    <w:tc>
+                      <w:p>
+                        <w:r>
+                          <w:t xml:space="preserve">Tower 025, level 2</w:t>
+                        </w:r>
+                      </w:p>
+                    </w:tc>
+                    <w:tc>
+                      <w:p>
+                        <w:r>
+                          <w:t xml:space="preserve">Cell 025.2.1 fox مرحبا</w:t>
+                        </w:r>
+                      </w:p>
+                    </w:tc>
+                  </w:tr>
+                  <w:tr>
+                    <w:tc>
+                      <w:p>
+                        <w:r>
+                          <w:t xml:space="preserve">Cell 025.2.2 fox مرحبا</w:t>
+                        </w:r>
+                      </w:p>
+                    </w:tc>
+                    <w:tc>
+                      <w:p>
+                        <w:r>
+                          <w:t xml:space="preserve">Cell 025.2.3 fox مرحبا</w:t>
+                        </w:r>
+                      </w:p>
+                    </w:tc>
+                  </w:tr>
+                </w:tbl>
+              </w:tc>
+              <w:tc>
+                <w:p>
+                  <w:r>
+                    <w:t xml:space="preserve">Cell 025.1.1 fox مرحبا</w:t>
+                  </w:r>
+                </w:p>
+              </w:tc>
+            </w:tr>
+            <w:tr>
+              <w:tc>
+                <w:p>
+                  <w:r>
+                    <w:t xml:space="preserve">Cell 025.1.2 fox مرحبا</w:t>
+                  </w:r>
+                </w:p>
+              </w:tc>
+              <w:tc>
+                <w:p>
+                  <w:r>
+                    <w:t xml:space="preserve">Cell 025.1.3 fox مرحبا</w:t>
+                  </w:r>
+                </w:p>
+              </w:tc>
+            </w:tr>
+          </w:tbl>
+        </w:tc>
+        <w:tc>
+          <w:p>
+            <w:r>
+              <w:t xml:space="preserve">Cell 025.0.1 fox مرحبا</w:t>
+            </w:r>
+          </w:p>
+        </w:tc>
+      </w:tr>
+      <w:tr>
+        <w:tc>
+          <w:p>
+            <w:r>
+              <w:t xml:space="preserve">Cell 025.0.2 fox مرحبا</w:t>
+            </w:r>
+          </w:p>
+        </w:tc>
+        <w:tc>
+          <w:p>
+            <w:r>
+              <w:t xml:space="preserve">Cell 025.0.3 fox مرحبا</w:t>
+            </w:r>
+          </w:p>
+        </w:tc>
+      </w:tr>
+    </w:tbl>
+    <w:p>
+      <w:r>
+        <w:t xml:space="preserve">Between towers 025. The quick brown fox jumps over the lazy dog. مرحبا بالعالم، هذا نص حشو لقياس استهلاك الذاكرة.</w:t>
+      </w:r>
+    </w:p>
+    <w:tbl>
+      <w:tr>
+        <w:tc>
+          <w:p>
+            <w:r>
+              <w:t xml:space="preserve">Tower 026, level 0</w:t>
+            </w:r>
+          </w:p>
+          <w:tbl>
+            <w:tr>
+              <w:tc>
+                <w:p>
+                  <w:r>
+                    <w:t xml:space="preserve">Tower 026, level 1</w:t>
+                  </w:r>
+                </w:p>
+                <w:tbl>
+                  <w:tr>
+                    <w:tc>
+                      <w:p>
+                        <w:r>
+                          <w:t xml:space="preserve">Tower 026, level 2</w:t>
+                        </w:r>
+                      </w:p>
+                    </w:tc>
+                    <w:tc>
+                      <w:p>
+                        <w:r>
+                          <w:t xml:space="preserve">Cell 026.2.1 fox مرحبا</w:t>
+                        </w:r>
+                      </w:p>
+                    </w:tc>
+                  </w:tr>
+                  <w:tr>
+                    <w:tc>
+                      <w:p>
+                        <w:r>
+                          <w:t xml:space="preserve">Cell 026.2.2 fox مرحبا</w:t>
+                        </w:r>
+                      </w:p>
+                    </w:tc>
+                    <w:tc>
+                      <w:p>
+                        <w:r>
+                          <w:t xml:space="preserve">Cell 026.2.3 fox مرحبا</w:t>
+                        </w:r>
+                      </w:p>
+                    </w:tc>
+                  </w:tr>
+                </w:tbl>
+              </w:tc>
+              <w:tc>
+                <w:p>
+                  <w:r>
+                    <w:t xml:space="preserve">Cell 026.1.1 fox مرحبا</w:t>
+                  </w:r>
+                </w:p>
+              </w:tc>
+            </w:tr>
+            <w:tr>
+              <w:tc>
+                <w:p>
+                  <w:r>
+                    <w:t xml:space="preserve">Cell 026.1.2 fox مرحبا</w:t>
+                  </w:r>
+                </w:p>
+              </w:tc>
+              <w:tc>
+                <w:p>
+                  <w:r>
+                    <w:t xml:space="preserve">Cell 026.1.3 fox مرحبا</w:t>
+                  </w:r>
+                </w:p>
+              </w:tc>
+            </w:tr>
+          </w:tbl>
+        </w:tc>
+        <w:tc>
+          <w:p>
+            <w:r>
+              <w:t xml:space="preserve">Cell 026.0.1 fox مرحبا</w:t>
+            </w:r>
+          </w:p>
+        </w:tc>
+      </w:tr>
+      <w:tr>
+        <w:tc>
+          <w:p>
+            <w:r>
+              <w:t xml:space="preserve">Cell 026.0.2 fox مرحبا</w:t>
+            </w:r>
+          </w:p>
+        </w:tc>
+        <w:tc>
+          <w:p>
+            <w:r>
+              <w:t xml:space="preserve">Cell 026.0.3 fox مرحبا</w:t>
+            </w:r>
+          </w:p>
+        </w:tc>
+      </w:tr>
+    </w:tbl>
+    <w:p>
+      <w:r>
+        <w:t xml:space="preserve">Between towers 026. The quick brown fox jumps over the lazy dog. مرحبا بالعالم، هذا نص حشو لقياس استهلاك الذاكرة.</w:t>
+      </w:r>
+    </w:p>
+    <w:tbl>
+      <w:tr>
+        <w:tc>
+          <w:p>
+            <w:r>
+              <w:t xml:space="preserve">Tower 027, level 0</w:t>
+            </w:r>
+          </w:p>
+          <w:tbl>
+            <w:tr>
+              <w:tc>
+                <w:p>
+                  <w:r>
+                    <w:t xml:space="preserve">Tower 027, level 1</w:t>
+                  </w:r>
+                </w:p>
+                <w:tbl>
+                  <w:tr>
+                    <w:tc>
+                      <w:p>
+                        <w:r>
+                          <w:t xml:space="preserve">Tower 027, level 2</w:t>
+                        </w:r>
+                      </w:p>
+                    </w:tc>
+                    <w:tc>
+                      <w:p>
+                        <w:r>
+                          <w:t xml:space="preserve">Cell 027.2.1 fox مرحبا</w:t>
+                        </w:r>
+                      </w:p>
+                    </w:tc>
+                  </w:tr>
+                  <w:tr>
+                    <w:tc>
+                      <w:p>
+                        <w:r>
+                          <w:t xml:space="preserve">Cell 027.2.2 fox مرحبا</w:t>
+                        </w:r>
+                      </w:p>
+                    </w:tc>
+                    <w:tc>
+                      <w:p>
+                        <w:r>
+                          <w:t xml:space="preserve">Cell 027.2.3 fox مرحبا</w:t>
+                        </w:r>
+                      </w:p>
+                    </w:tc>
+                  </w:tr>
+                </w:tbl>
+              </w:tc>
+              <w:tc>
+                <w:p>
+                  <w:r>
+                    <w:t xml:space="preserve">Cell 027.1.1 fox مرحبا</w:t>
+                  </w:r>
+                </w:p>
+              </w:tc>
+            </w:tr>
+            <w:tr>
+              <w:tc>
+                <w:p>
+                  <w:r>
+                    <w:t xml:space="preserve">Cell 027.1.2 fox مرحبا</w:t>
+                  </w:r>
+                </w:p>
+              </w:tc>
+              <w:tc>
+                <w:p>
+                  <w:r>
+                    <w:t xml:space="preserve">Cell 027.1.3 fox مرحبا</w:t>
+                  </w:r>
+                </w:p>
+              </w:tc>
+            </w:tr>
+          </w:tbl>
+        </w:tc>
+        <w:tc>
+          <w:p>
+            <w:r>
+              <w:t xml:space="preserve">Cell 027.0.1 fox مرحبا</w:t>
+            </w:r>
+          </w:p>
+        </w:tc>
+      </w:tr>
+      <w:tr>
+        <w:tc>
+          <w:p>
+            <w:r>
+              <w:t xml:space="preserve">Cell 027.0.2 fox مرحبا</w:t>
+            </w:r>
+          </w:p>
+        </w:tc>
+        <w:tc>
+          <w:p>
+            <w:r>
+              <w:t xml:space="preserve">Cell 027.0.3 fox مرحبا</w:t>
+            </w:r>
+          </w:p>
+        </w:tc>
+      </w:tr>
+    </w:tbl>
+    <w:p>
+      <w:r>
+        <w:t xml:space="preserve">Between towers 027. The quick brown fox jumps over the lazy dog. مرحبا بالعالم، هذا نص حشو لقياس استهلاك الذاكرة.</w:t>
+      </w:r>
+    </w:p>
+    <w:tbl>
+      <w:tr>
+        <w:tc>
+          <w:p>
+            <w:r>
+              <w:t xml:space="preserve">Tower 028, level 0</w:t>
+            </w:r>
+          </w:p>
+          <w:tbl>
+            <w:tr>
+              <w:tc>
+                <w:p>
+                  <w:r>
+                    <w:t xml:space="preserve">Tower 028, level 1</w:t>
+                  </w:r>
+                </w:p>
+                <w:tbl>
+                  <w:tr>
+                    <w:tc>
+                      <w:p>
+                        <w:r>
+                          <w:t xml:space="preserve">Tower 028, level 2</w:t>
+                        </w:r>
+                      </w:p>
+                    </w:tc>
+                    <w:tc>
+                      <w:p>
+                        <w:r>
+                          <w:t xml:space="preserve">Cell 028.2.1 fox مرحبا</w:t>
+                        </w:r>
+                      </w:p>
+                    </w:tc>
+                  </w:tr>
+                  <w:tr>
+                    <w:tc>
+                      <w:p>
+                        <w:r>
+                          <w:t xml:space="preserve">Cell 028.2.2 fox مرحبا</w:t>
+                        </w:r>
+                      </w:p>
+                    </w:tc>
+                    <w:tc>
+                      <w:p>
+                        <w:r>
+                          <w:t xml:space="preserve">Cell 028.2.3 fox مرحبا</w:t>
+                        </w:r>
+                      </w:p>
+                    </w:tc>
+                  </w:tr>
+                </w:tbl>
+              </w:tc>
+              <w:tc>
+                <w:p>
+                  <w:r>
+                    <w:t xml:space="preserve">Cell 028.1.1 fox مرحبا</w:t>
+                  </w:r>
+                </w:p>
+              </w:tc>
+            </w:tr>
+            <w:tr>
+              <w:tc>
+                <w:p>
+                  <w:r>
+                    <w:t xml:space="preserve">Cell 028.1.2 fox مرحبا</w:t>
+                  </w:r>
+                </w:p>
+              </w:tc>
+              <w:tc>
+                <w:p>
+                  <w:r>
+                    <w:t xml:space="preserve">Cell 028.1.3 fox مرحبا</w:t>
+                  </w:r>
+                </w:p>
+              </w:tc>
+            </w:tr>
+          </w:tbl>
+        </w:tc>
+        <w:tc>
+          <w:p>
+            <w:r>
+              <w:t xml:space="preserve">Cell 028.0.1 fox مرحبا</w:t>
+            </w:r>
+          </w:p>
+        </w:tc>
+      </w:tr>
+      <w:tr>
+        <w:tc>
+          <w:p>
+            <w:r>
+              <w:t xml:space="preserve">Cell 028.0.2 fox مرحبا</w:t>
+            </w:r>
+          </w:p>
+        </w:tc>
+        <w:tc>
+          <w:p>
+            <w:r>
+              <w:t xml:space="preserve">Cell 028.0.3 fox مرحبا</w:t>
+            </w:r>
+          </w:p>
+        </w:tc>
+      </w:tr>
+    </w:tbl>
+    <w:p>
+      <w:r>
+        <w:t xml:space="preserve">Between towers 028. The quick brown fox jumps over the lazy dog. مرحبا بالعالم، هذا نص حشو لقياس استهلاك الذاكرة.</w:t>
+      </w:r>
+    </w:p>
+    <w:tbl>
+      <w:tr>
+        <w:tc>
+          <w:p>
+            <w:r>
+              <w:t xml:space="preserve">Tower 029, level 0</w:t>
+            </w:r>
+          </w:p>
+          <w:tbl>
+            <w:tr>
+              <w:tc>
+                <w:p>
+                  <w:r>
+                    <w:t xml:space="preserve">Tower 029, level 1</w:t>
+                  </w:r>
+                </w:p>
+                <w:tbl>
+                  <w:tr>
+                    <w:tc>
+                      <w:p>
+                        <w:r>
+                          <w:t xml:space="preserve">Tower 029, level 2</w:t>
+                        </w:r>
+                      </w:p>
+                    </w:tc>
+                    <w:tc>
+                      <w:p>
+                        <w:r>
+                          <w:t xml:space="preserve">Cell 029.2.1 fox مرحبا</w:t>
+                        </w:r>
+                      </w:p>
+                    </w:tc>
+                  </w:tr>
+                  <w:tr>
+                    <w:tc>
+                      <w:p>
+                        <w:r>
+                          <w:t xml:space="preserve">Cell 029.2.2 fox مرحبا</w:t>
+                        </w:r>
+                      </w:p>
+                    </w:tc>
+                    <w:tc>
+                      <w:p>
+                        <w:r>
+                          <w:t xml:space="preserve">Cell 029.2.3 fox مرحبا</w:t>
+                        </w:r>
+                      </w:p>
+                    </w:tc>
+                  </w:tr>
+                </w:tbl>
+              </w:tc>
+              <w:tc>
+                <w:p>
+                  <w:r>
+                    <w:t xml:space="preserve">Cell 029.1.1 fox مرحبا</w:t>
+                  </w:r>
+                </w:p>
+              </w:tc>
+            </w:tr>
+            <w:tr>
+              <w:tc>
+                <w:p>
+                  <w:r>
+                    <w:t xml:space="preserve">Cell 029.1.2 fox مرحبا</w:t>
+                  </w:r>
+                </w:p>
+              </w:tc>
+              <w:tc>
+                <w:p>
+                  <w:r>
+                    <w:t xml:space="preserve">Cell 029.1.3 fox مرحبا</w:t>
+                  </w:r>
+                </w:p>
+              </w:tc>
+            </w:tr>
+          </w:tbl>
+        </w:tc>
+        <w:tc>
+          <w:p>
+            <w:r>
+              <w:t xml:space="preserve">Cell 029.0.1 fox مرحبا</w:t>
+            </w:r>
+          </w:p>
+        </w:tc>
+      </w:tr>
+      <w:tr>
+        <w:tc>
+          <w:p>
+            <w:r>
+              <w:t xml:space="preserve">Cell 029.0.2 fox مرحبا</w:t>
+            </w:r>
+          </w:p>
+        </w:tc>
+        <w:tc>
+          <w:p>
+            <w:r>
+              <w:t xml:space="preserve">Cell 029.0.3 fox مرحبا</w:t>
+            </w:r>
+          </w:p>
+        </w:tc>
+      </w:tr>
+    </w:tbl>
+    <w:p>
+      <w:r>
+        <w:t xml:space="preserve">Between towers 029. The quick brown fox jumps over the lazy dog. مرحبا بالعالم، هذا نص حشو لقياس استهلاك الذاكرة.</w:t>
+      </w:r>
+    </w:p>
     <w:sectPr/>
   </w:body>
 </w:document>

</xml_diff>